<commit_message>
Stjernekort: ret nummereringsfejl i docx_reader.py ved tomme overskrifter
docx_reader.py sprang tomme afsnit over FØR det tjekkede overskriftsstil,
så et tomt "Heading 1"-afsnit (en efterladt titel-pladsholder) aldrig talte
med i nummereringen - hvilket forskød al efterfølgende nummerering i
dokumentet med 1 i forhold til hvad Word selv viser. Overskriftstælleren
opdateres nu før tom-tekst-tjekket.

Fixet afslørede at "Bilag 12 -> Bilag 5 pkt. 8.4" i DVR-materialet faktisk
er korrekt (var en falsk positiv, test_dvr.py opdateret), og to hidtil
skjulte, ægte citationsfejl i ESDH Bilag 04 (Afprøvning): "punkt 2.1" ->
"punkt 3.1", "punkt 4.3" -> "punkt 5.3" - begge rettet direkte i
dokumentet. Se RETTELSE_docx_reader_nummerering_2026-09-25.txt for detaljer.

Co-Authored-By: Claude Sonnet 5 <noreply@anthropic.com>
</commit_message>
<xml_diff>
--- a/Stjernekort/testdata/esdh/13. Bilag 04_Afprøvning.docx
+++ b/Stjernekort/testdata/esdh/13. Bilag 04_Afprøvning.docx
@@ -5475,7 +5475,7 @@
         <w:fldChar w:fldCharType="separate"/>
       </w:r>
       <w:r>
-        <w:t>2.1</w:t>
+        <w:t>3.1</w:t>
       </w:r>
       <w:r>
         <w:fldChar w:fldCharType="end"/>
@@ -6337,7 +6337,7 @@
         <w:fldChar w:fldCharType="separate"/>
       </w:r>
       <w:r>
-        <w:t>4.3</w:t>
+        <w:t>5.3</w:t>
       </w:r>
       <w:r>
         <w:fldChar w:fldCharType="end"/>

</xml_diff>